<commit_message>
feat(tools+docs): install WB/Data360 MCP + Stata skill; English Appendix A + Mermaid data-flow
Documents (both requested):
- thesis/appendix_A_data_harmonisation_en.md — English (JIBS-register) version of
  the WBES pooling/harmonisation methodology appendix, APA-7 cited.
- Mermaid PRISMA-style data-flow diagram (Figure A.1) added to both VI and EN
  appendices (119 files -> S1-S6 -> 96,415 -> 91,982 -> 84,910).

Tooling installed:
- .mcp.json — project-scoped MCP servers: world-bank (World Bank Open Data API),
  data360 (World Bank Data360); run via uv. tools/mcp/ vendors both repos +
  awesome-ai-for-economists; tools/mcp/README.md documents setup (needs network).
- .claude/skills/stata-wbes-runner/ — project Stata skill (batch do-file runner +
  log/error parsing) with Python fallback for this no-Stata container, an integrity
  rule against fabricating coefficients, and the WBES re-estimation workflow.

Linter clean; appendix docx (VI+EN) regenerated.
</commit_message>
<xml_diff>
--- a/dist/luan_an_ctu/phu_luc_A_hop_nhat_du_lieu_vi.docx
+++ b/dist/luan_an_ctu/phu_luc_A_hop_nhat_du_lieu_vi.docx
@@ -1018,6 +1018,111 @@
     <w:p>
       <w:pPr>
         <w:pStyle w:val="BodyText"/>
+      </w:pPr>
+      <w:r>
+        <w:rPr>
+          <w:bCs/>
+          <w:b/>
+        </w:rPr>
+        <w:t xml:space="preserve">Hình A.1.</w:t>
+      </w:r>
+      <w:r>
+        <w:t xml:space="preserve"> </w:t>
+      </w:r>
+      <w:r>
+        <w:rPr>
+          <w:iCs/>
+          <w:i/>
+        </w:rPr>
+        <w:t xml:space="preserve">Sơ đồ dòng dữ liệu hợp nhất WBES (kiểu PRISMA).</w:t>
+      </w:r>
+    </w:p>
+    <w:p>
+      <w:pPr>
+        <w:pStyle w:val="SourceCode"/>
+      </w:pPr>
+      <w:r>
+        <w:rPr>
+          <w:rStyle w:val="VerbatimChar"/>
+        </w:rPr>
+        <w:t xml:space="preserve">flowchart TD</w:t>
+      </w:r>
+      <w:r>
+        <w:br/>
+      </w:r>
+      <w:r>
+        <w:rPr>
+          <w:rStyle w:val="VerbatimChar"/>
+        </w:rPr>
+        <w:t xml:space="preserve">    A["119 tệp khảo sát WBES&lt;br/&gt;quốc gia–năm (thô)"] --&gt;|"S1 · lọc cross-section chuẩn;&lt;br/&gt;loại panel/Informal/ISBS/ISES/Micro/TGS; năm ≥ 2006"| B["Lát cắt ngang chuẩn ≥ 2006"]</w:t>
+      </w:r>
+      <w:r>
+        <w:br/>
+      </w:r>
+      <w:r>
+        <w:rPr>
+          <w:rStyle w:val="VerbatimChar"/>
+        </w:rPr>
+        <w:t xml:space="preserve">    B --&gt;|"S2 · khử trùng lặp"| C["Một khảo sát / cặp (nền × năm)"]</w:t>
+      </w:r>
+      <w:r>
+        <w:br/>
+      </w:r>
+      <w:r>
+        <w:rPr>
+          <w:rStyle w:val="VerbatimChar"/>
+        </w:rPr>
+        <w:t xml:space="preserve">    C --&gt;|"S3 · hài hòa hóa biến&lt;br/&gt;(LP, FSTS, TCI/DAI, controls)"| D["Lược đồ biến chung"]</w:t>
+      </w:r>
+      <w:r>
+        <w:br/>
+      </w:r>
+      <w:r>
+        <w:rPr>
+          <w:rStyle w:val="VerbatimChar"/>
+        </w:rPr>
+        <w:t xml:space="preserve">    D --&gt;|"S4 · mã thiếu −9/−8/−7 → khuyết;&lt;br/&gt;kiểm tra miền giá trị"| E["106.765 bản ghi doanh nghiệp–năm"]</w:t>
+      </w:r>
+      <w:r>
+        <w:br/>
+      </w:r>
+      <w:r>
+        <w:rPr>
+          <w:rStyle w:val="VerbatimChar"/>
+        </w:rPr>
+        <w:t xml:space="preserve">    E --&gt;|"S5 · gán chế độ thể chế ICRV&lt;br/&gt;(đủ chỉ số WGI)"| F["96.415 DN phân loại · 52 nền"]</w:t>
+      </w:r>
+      <w:r>
+        <w:br/>
+      </w:r>
+      <w:r>
+        <w:rPr>
+          <w:rStyle w:val="VerbatimChar"/>
+        </w:rPr>
+        <w:t xml:space="preserve">    F --&gt;|"loại Comoros / Cyprus / Türkiye&lt;br/&gt;(ngoài Á–Thái Bình Dương)"| G["91.982 DN · 49 nền&lt;br/&gt;— MẪU PHÂN TÍCH"]</w:t>
+      </w:r>
+      <w:r>
+        <w:br/>
+      </w:r>
+      <w:r>
+        <w:rPr>
+          <w:rStyle w:val="VerbatimChar"/>
+        </w:rPr>
+        <w:t xml:space="preserve">    G --&gt;|"S6 · listwise tập biến trọng tâm"| H["84.910 — N hồi quy M2"]</w:t>
+      </w:r>
+      <w:r>
+        <w:br/>
+      </w:r>
+      <w:r>
+        <w:rPr>
+          <w:rStyle w:val="VerbatimChar"/>
+        </w:rPr>
+        <w:t xml:space="preserve">    H --&gt;|"+ đầy đủ biến kiểm soát"| I["38.342 — M5 (two-way FE)"]</w:t>
+      </w:r>
+    </w:p>
+    <w:p>
+      <w:pPr>
+        <w:pStyle w:val="FirstParagraph"/>
       </w:pPr>
       <w:r>
         <w:rPr>

</xml_diff>